<commit_message>
I commit to make the spa the best
</commit_message>
<xml_diff>
--- a/Pabii's Retreat/Documents/content and research.docx
+++ b/Pabii's Retreat/Documents/content and research.docx
@@ -10,7 +10,6 @@
           <w:docPartUnique/>
         </w:docPartObj>
       </w:sdtPr>
-      <w:sdtEndPr/>
       <w:sdtContent>
         <w:p>
           <w:r>
@@ -103,7 +102,6 @@
                                   <w:dataBinding w:prefixMappings="xmlns:ns0='http://schemas.openxmlformats.org/package/2006/metadata/core-properties' xmlns:ns1='http://purl.org/dc/elements/1.1/'" w:xpath="/ns0:coreProperties[1]/ns1:title[1]" w:storeItemID="{6C3C8BC8-F283-45AE-878A-BAB7291924A1}"/>
                                   <w:text/>
                                 </w:sdtPr>
-                                <w:sdtEndPr/>
                                 <w:sdtContent>
                                   <w:p>
                                     <w:pPr>
@@ -177,7 +175,6 @@
                                   <w:dataBinding w:prefixMappings="xmlns:ns0='http://schemas.microsoft.com/office/2006/coverPageProps'" w:xpath="/ns0:CoverPageProperties[1]/ns0:Abstract[1]" w:storeItemID="{55AF091B-3C7A-41E3-B477-F2FDAA23CFDA}"/>
                                   <w:text/>
                                 </w:sdtPr>
-                                <w:sdtEndPr/>
                                 <w:sdtContent>
                                   <w:p>
                                     <w:pPr>
@@ -261,7 +258,6 @@
                             <w:dataBinding w:prefixMappings="xmlns:ns0='http://schemas.openxmlformats.org/package/2006/metadata/core-properties' xmlns:ns1='http://purl.org/dc/elements/1.1/'" w:xpath="/ns0:coreProperties[1]/ns1:title[1]" w:storeItemID="{6C3C8BC8-F283-45AE-878A-BAB7291924A1}"/>
                             <w:text/>
                           </w:sdtPr>
-                          <w:sdtEndPr/>
                           <w:sdtContent>
                             <w:p>
                               <w:pPr>
@@ -335,7 +331,6 @@
                             <w:dataBinding w:prefixMappings="xmlns:ns0='http://schemas.microsoft.com/office/2006/coverPageProps'" w:xpath="/ns0:CoverPageProperties[1]/ns0:Abstract[1]" w:storeItemID="{55AF091B-3C7A-41E3-B477-F2FDAA23CFDA}"/>
                             <w:text/>
                           </w:sdtPr>
-                          <w:sdtEndPr/>
                           <w:sdtContent>
                             <w:p>
                               <w:pPr>
@@ -460,7 +455,6 @@
                                   <w:dataBinding w:prefixMappings="xmlns:ns0='http://schemas.openxmlformats.org/package/2006/metadata/core-properties' xmlns:ns1='http://purl.org/dc/elements/1.1/'" w:xpath="/ns0:coreProperties[1]/ns1:subject[1]" w:storeItemID="{6C3C8BC8-F283-45AE-878A-BAB7291924A1}"/>
                                   <w:text/>
                                 </w:sdtPr>
-                                <w:sdtEndPr/>
                                 <w:sdtContent>
                                   <w:p>
                                     <w:pPr>
@@ -517,7 +511,6 @@
                             <w:dataBinding w:prefixMappings="xmlns:ns0='http://schemas.openxmlformats.org/package/2006/metadata/core-properties' xmlns:ns1='http://purl.org/dc/elements/1.1/'" w:xpath="/ns0:coreProperties[1]/ns1:subject[1]" w:storeItemID="{6C3C8BC8-F283-45AE-878A-BAB7291924A1}"/>
                             <w:text/>
                           </w:sdtPr>
-                          <w:sdtEndPr/>
                           <w:sdtContent>
                             <w:p>
                               <w:pPr>
@@ -585,6 +578,15 @@
     </w:p>
     <w:sdt>
       <w:sdtPr>
+        <w:rPr>
+          <w:rFonts w:asciiTheme="minorHAnsi" w:eastAsiaTheme="minorHAnsi" w:hAnsiTheme="minorHAnsi" w:cstheme="minorBidi"/>
+          <w:color w:val="auto"/>
+          <w:kern w:val="2"/>
+          <w:sz w:val="24"/>
+          <w:szCs w:val="24"/>
+          <w:lang w:val="en-ZA"/>
+          <w14:ligatures w14:val="standardContextual"/>
+        </w:rPr>
         <w:id w:val="2136366793"/>
         <w:docPartObj>
           <w:docPartGallery w:val="Table of Contents"/>
@@ -593,16 +595,9 @@
       </w:sdtPr>
       <w:sdtEndPr>
         <w:rPr>
-          <w:rFonts w:asciiTheme="minorHAnsi" w:eastAsiaTheme="minorHAnsi" w:hAnsiTheme="minorHAnsi" w:cstheme="minorBidi"/>
           <w:b/>
           <w:bCs/>
           <w:noProof/>
-          <w:color w:val="auto"/>
-          <w:kern w:val="2"/>
-          <w:sz w:val="24"/>
-          <w:szCs w:val="24"/>
-          <w:lang w:val="en-ZA"/>
-          <w14:ligatures w14:val="standardContextual"/>
         </w:rPr>
       </w:sdtEndPr>
       <w:sdtContent>
@@ -2473,6 +2468,17 @@
         </w:rPr>
       </w:pPr>
       <w:bookmarkStart w:id="5" w:name="_Toc237466574"/>
+    </w:p>
+    <w:p>
+      <w:pPr>
+        <w:pStyle w:val="Heading2"/>
+        <w:rPr>
+          <w:rFonts w:asciiTheme="minorHAnsi" w:hAnsiTheme="minorHAnsi"/>
+          <w:b/>
+          <w:bCs/>
+          <w:color w:val="000000" w:themeColor="text1"/>
+        </w:rPr>
+      </w:pPr>
       <w:r>
         <w:rPr>
           <w:rFonts w:asciiTheme="minorHAnsi" w:hAnsiTheme="minorHAnsi"/>
@@ -2522,7 +2528,6 @@
           <w:sz w:val="22"/>
           <w:szCs w:val="22"/>
         </w:rPr>
-        <w:lastRenderedPageBreak/>
         <w:t>Welcome juice</w:t>
       </w:r>
     </w:p>
@@ -2678,16 +2683,14 @@
         <w:spacing w:line="360" w:lineRule="auto"/>
         <w:contextualSpacing/>
         <w:rPr>
-          <w:color w:val="C00000"/>
-          <w:sz w:val="22"/>
-          <w:szCs w:val="22"/>
-        </w:rPr>
-      </w:pPr>
-      <w:r>
-        <w:rPr>
-          <w:b/>
-          <w:bCs/>
-          <w:color w:val="C00000"/>
+          <w:sz w:val="22"/>
+          <w:szCs w:val="22"/>
+        </w:rPr>
+      </w:pPr>
+      <w:r>
+        <w:rPr>
+          <w:b/>
+          <w:bCs/>
           <w:sz w:val="22"/>
           <w:szCs w:val="22"/>
         </w:rPr>
@@ -2695,7 +2698,6 @@
       </w:r>
       <w:r>
         <w:rPr>
-          <w:color w:val="C00000"/>
           <w:sz w:val="22"/>
           <w:szCs w:val="22"/>
         </w:rPr>
@@ -2831,470 +2833,6 @@
       <w:pPr>
         <w:spacing w:line="360" w:lineRule="auto"/>
         <w:rPr>
-          <w:color w:val="C00000"/>
-          <w:sz w:val="22"/>
-          <w:szCs w:val="22"/>
-        </w:rPr>
-      </w:pPr>
-      <w:r>
-        <w:rPr>
-          <w:color w:val="C00000"/>
-          <w:sz w:val="22"/>
-          <w:szCs w:val="22"/>
-        </w:rPr>
-        <w:t>Packages</w:t>
-      </w:r>
-    </w:p>
-    <w:p>
-      <w:pPr>
-        <w:pStyle w:val="ListParagraph"/>
-        <w:numPr>
-          <w:ilvl w:val="0"/>
-          <w:numId w:val="14"/>
-        </w:numPr>
-        <w:spacing w:line="360" w:lineRule="auto"/>
-        <w:rPr>
-          <w:color w:val="C00000"/>
-          <w:sz w:val="22"/>
-          <w:szCs w:val="22"/>
-        </w:rPr>
-      </w:pPr>
-      <w:r>
-        <w:rPr>
-          <w:color w:val="C00000"/>
-          <w:sz w:val="22"/>
-          <w:szCs w:val="22"/>
-        </w:rPr>
-        <w:t>Group Booking</w:t>
-      </w:r>
-    </w:p>
-    <w:p>
-      <w:pPr>
-        <w:spacing w:line="360" w:lineRule="auto"/>
-        <w:rPr>
-          <w:color w:val="C00000"/>
-          <w:sz w:val="22"/>
-          <w:szCs w:val="22"/>
-        </w:rPr>
-      </w:pPr>
-      <w:r>
-        <w:rPr>
-          <w:color w:val="C00000"/>
-          <w:sz w:val="22"/>
-          <w:szCs w:val="22"/>
-        </w:rPr>
-        <w:t>Designed for groups who want to enjoy a shared wellness experience.</w:t>
-      </w:r>
-    </w:p>
-    <w:p>
-      <w:pPr>
-        <w:pStyle w:val="ListParagraph"/>
-        <w:numPr>
-          <w:ilvl w:val="0"/>
-          <w:numId w:val="14"/>
-        </w:numPr>
-        <w:spacing w:line="360" w:lineRule="auto"/>
-        <w:rPr>
-          <w:color w:val="C00000"/>
-          <w:sz w:val="22"/>
-          <w:szCs w:val="22"/>
-        </w:rPr>
-      </w:pPr>
-      <w:r>
-        <w:rPr>
-          <w:color w:val="C00000"/>
-          <w:sz w:val="22"/>
-          <w:szCs w:val="22"/>
-        </w:rPr>
-        <w:t>Couples Booking</w:t>
-      </w:r>
-    </w:p>
-    <w:p>
-      <w:pPr>
-        <w:spacing w:line="360" w:lineRule="auto"/>
-        <w:rPr>
-          <w:color w:val="C00000"/>
-          <w:sz w:val="22"/>
-          <w:szCs w:val="22"/>
-        </w:rPr>
-      </w:pPr>
-      <w:r>
-        <w:rPr>
-          <w:color w:val="C00000"/>
-          <w:sz w:val="22"/>
-          <w:szCs w:val="22"/>
-        </w:rPr>
-        <w:lastRenderedPageBreak/>
-        <w:t xml:space="preserve"> Designed for couples.</w:t>
-      </w:r>
-    </w:p>
-    <w:p>
-      <w:pPr>
-        <w:pStyle w:val="ListParagraph"/>
-        <w:numPr>
-          <w:ilvl w:val="0"/>
-          <w:numId w:val="14"/>
-        </w:numPr>
-        <w:spacing w:line="360" w:lineRule="auto"/>
-        <w:rPr>
-          <w:color w:val="C00000"/>
-          <w:sz w:val="22"/>
-          <w:szCs w:val="22"/>
-        </w:rPr>
-      </w:pPr>
-      <w:r>
-        <w:rPr>
-          <w:color w:val="C00000"/>
-          <w:sz w:val="22"/>
-          <w:szCs w:val="22"/>
-        </w:rPr>
-        <w:t>Spa Day Package</w:t>
-      </w:r>
-    </w:p>
-    <w:p>
-      <w:pPr>
-        <w:spacing w:line="360" w:lineRule="auto"/>
-        <w:rPr>
-          <w:color w:val="C00000"/>
-          <w:sz w:val="22"/>
-          <w:szCs w:val="22"/>
-        </w:rPr>
-      </w:pPr>
-      <w:r>
-        <w:rPr>
-          <w:color w:val="C00000"/>
-          <w:sz w:val="22"/>
-          <w:szCs w:val="22"/>
-        </w:rPr>
-        <w:t>Relaxation and self-care.</w:t>
-      </w:r>
-    </w:p>
-    <w:p>
-      <w:pPr>
-        <w:pStyle w:val="ListParagraph"/>
-        <w:numPr>
-          <w:ilvl w:val="0"/>
-          <w:numId w:val="14"/>
-        </w:numPr>
-        <w:spacing w:line="360" w:lineRule="auto"/>
-        <w:rPr>
-          <w:color w:val="C00000"/>
-          <w:sz w:val="22"/>
-          <w:szCs w:val="22"/>
-        </w:rPr>
-      </w:pPr>
-      <w:r>
-        <w:rPr>
-          <w:color w:val="C00000"/>
-          <w:sz w:val="22"/>
-          <w:szCs w:val="22"/>
-        </w:rPr>
-        <w:t>Premium Full Day</w:t>
-      </w:r>
-    </w:p>
-    <w:p>
-      <w:pPr>
-        <w:spacing w:line="360" w:lineRule="auto"/>
-        <w:rPr>
-          <w:color w:val="C00000"/>
-          <w:sz w:val="22"/>
-          <w:szCs w:val="22"/>
-        </w:rPr>
-      </w:pPr>
-      <w:r>
-        <w:rPr>
-          <w:color w:val="C00000"/>
-          <w:sz w:val="22"/>
-          <w:szCs w:val="22"/>
-        </w:rPr>
-        <w:t>A premium full-day wellness experience.</w:t>
-      </w:r>
-    </w:p>
-    <w:p>
-      <w:pPr>
-        <w:pStyle w:val="ListParagraph"/>
-        <w:numPr>
-          <w:ilvl w:val="0"/>
-          <w:numId w:val="14"/>
-        </w:numPr>
-        <w:spacing w:line="360" w:lineRule="auto"/>
-        <w:rPr>
-          <w:color w:val="C00000"/>
-          <w:sz w:val="22"/>
-          <w:szCs w:val="22"/>
-        </w:rPr>
-      </w:pPr>
-      <w:r>
-        <w:rPr>
-          <w:color w:val="C00000"/>
-          <w:sz w:val="22"/>
-          <w:szCs w:val="22"/>
-        </w:rPr>
-        <w:t>Maternity Half Day</w:t>
-      </w:r>
-    </w:p>
-    <w:p>
-      <w:pPr>
-        <w:spacing w:line="360" w:lineRule="auto"/>
-        <w:rPr>
-          <w:color w:val="C00000"/>
-          <w:sz w:val="22"/>
-          <w:szCs w:val="22"/>
-        </w:rPr>
-      </w:pPr>
-      <w:r>
-        <w:rPr>
-          <w:color w:val="C00000"/>
-          <w:sz w:val="22"/>
-          <w:szCs w:val="22"/>
-        </w:rPr>
-        <w:t>A maternity-focused relaxation package. Any actual treatment suitability should be confirmed appropriately before offering it.</w:t>
-      </w:r>
-    </w:p>
-    <w:p>
-      <w:pPr>
-        <w:pStyle w:val="ListParagraph"/>
-        <w:numPr>
-          <w:ilvl w:val="0"/>
-          <w:numId w:val="14"/>
-        </w:numPr>
-        <w:spacing w:line="360" w:lineRule="auto"/>
-        <w:rPr>
-          <w:color w:val="C00000"/>
-          <w:sz w:val="22"/>
-          <w:szCs w:val="22"/>
-        </w:rPr>
-      </w:pPr>
-      <w:r>
-        <w:rPr>
-          <w:color w:val="C00000"/>
-          <w:sz w:val="22"/>
-          <w:szCs w:val="22"/>
-        </w:rPr>
-        <w:t>Moonlight Spa</w:t>
-      </w:r>
-    </w:p>
-    <w:p>
-      <w:pPr>
-        <w:spacing w:line="360" w:lineRule="auto"/>
-        <w:rPr>
-          <w:color w:val="C00000"/>
-          <w:sz w:val="22"/>
-          <w:szCs w:val="22"/>
-        </w:rPr>
-      </w:pPr>
-      <w:r>
-        <w:rPr>
-          <w:color w:val="C00000"/>
-          <w:sz w:val="22"/>
-          <w:szCs w:val="22"/>
-        </w:rPr>
-        <w:t>An evening wellness experience.</w:t>
-      </w:r>
-    </w:p>
-    <w:p>
-      <w:pPr>
-        <w:pStyle w:val="ListParagraph"/>
-        <w:numPr>
-          <w:ilvl w:val="0"/>
-          <w:numId w:val="14"/>
-        </w:numPr>
-        <w:spacing w:line="360" w:lineRule="auto"/>
-        <w:rPr>
-          <w:color w:val="C00000"/>
-          <w:sz w:val="22"/>
-          <w:szCs w:val="22"/>
-        </w:rPr>
-      </w:pPr>
-      <w:r>
-        <w:rPr>
-          <w:color w:val="C00000"/>
-          <w:sz w:val="22"/>
-          <w:szCs w:val="22"/>
-        </w:rPr>
-        <w:t>Full Day Package</w:t>
-      </w:r>
-    </w:p>
-    <w:p>
-      <w:pPr>
-        <w:spacing w:line="360" w:lineRule="auto"/>
-        <w:rPr>
-          <w:color w:val="C00000"/>
-          <w:sz w:val="22"/>
-          <w:szCs w:val="22"/>
-        </w:rPr>
-      </w:pPr>
-      <w:r>
-        <w:rPr>
-          <w:color w:val="C00000"/>
-          <w:sz w:val="22"/>
-          <w:szCs w:val="22"/>
-        </w:rPr>
-        <w:t>A full-day experience with some selected treatments and relaxation activities such as pool lunch.</w:t>
-      </w:r>
-    </w:p>
-    <w:p>
-      <w:pPr>
-        <w:pStyle w:val="ListParagraph"/>
-        <w:numPr>
-          <w:ilvl w:val="0"/>
-          <w:numId w:val="14"/>
-        </w:numPr>
-        <w:spacing w:line="360" w:lineRule="auto"/>
-        <w:rPr>
-          <w:color w:val="C00000"/>
-          <w:sz w:val="22"/>
-          <w:szCs w:val="22"/>
-        </w:rPr>
-      </w:pPr>
-      <w:r>
-        <w:rPr>
-          <w:color w:val="C00000"/>
-          <w:sz w:val="22"/>
-          <w:szCs w:val="22"/>
-        </w:rPr>
-        <w:t>Corporate Retreat</w:t>
-      </w:r>
-    </w:p>
-    <w:p>
-      <w:pPr>
-        <w:spacing w:line="360" w:lineRule="auto"/>
-        <w:rPr>
-          <w:color w:val="C00000"/>
-          <w:sz w:val="22"/>
-          <w:szCs w:val="22"/>
-        </w:rPr>
-      </w:pPr>
-      <w:r>
-        <w:rPr>
-          <w:color w:val="C00000"/>
-          <w:sz w:val="22"/>
-          <w:szCs w:val="22"/>
-        </w:rPr>
-        <w:t>Designed for organisations and teams for so relaxation.</w:t>
-      </w:r>
-    </w:p>
-    <w:p>
-      <w:pPr>
-        <w:pStyle w:val="ListParagraph"/>
-        <w:numPr>
-          <w:ilvl w:val="0"/>
-          <w:numId w:val="14"/>
-        </w:numPr>
-        <w:spacing w:line="360" w:lineRule="auto"/>
-        <w:rPr>
-          <w:color w:val="C00000"/>
-          <w:sz w:val="22"/>
-          <w:szCs w:val="22"/>
-        </w:rPr>
-      </w:pPr>
-      <w:r>
-        <w:rPr>
-          <w:color w:val="C00000"/>
-          <w:sz w:val="22"/>
-          <w:szCs w:val="22"/>
-        </w:rPr>
-        <w:t>Romantic Escape</w:t>
-      </w:r>
-    </w:p>
-    <w:p>
-      <w:pPr>
-        <w:spacing w:line="360" w:lineRule="auto"/>
-        <w:rPr>
-          <w:color w:val="C00000"/>
-          <w:sz w:val="22"/>
-          <w:szCs w:val="22"/>
-        </w:rPr>
-      </w:pPr>
-      <w:r>
-        <w:rPr>
-          <w:color w:val="C00000"/>
-          <w:sz w:val="22"/>
-          <w:szCs w:val="22"/>
-        </w:rPr>
-        <w:t>A couples quality time.</w:t>
-      </w:r>
-    </w:p>
-    <w:p>
-      <w:pPr>
-        <w:spacing w:line="360" w:lineRule="auto"/>
-        <w:rPr>
-          <w:color w:val="C00000"/>
-          <w:sz w:val="22"/>
-          <w:szCs w:val="22"/>
-        </w:rPr>
-      </w:pPr>
-    </w:p>
-    <w:p>
-      <w:pPr>
-        <w:spacing w:line="360" w:lineRule="auto"/>
-        <w:rPr>
-          <w:b/>
-          <w:bCs/>
-          <w:sz w:val="22"/>
-          <w:szCs w:val="22"/>
-        </w:rPr>
-      </w:pPr>
-    </w:p>
-    <w:p>
-      <w:pPr>
-        <w:spacing w:line="360" w:lineRule="auto"/>
-        <w:rPr>
-          <w:b/>
-          <w:bCs/>
-          <w:sz w:val="22"/>
-          <w:szCs w:val="22"/>
-        </w:rPr>
-      </w:pPr>
-    </w:p>
-    <w:p>
-      <w:pPr>
-        <w:spacing w:line="360" w:lineRule="auto"/>
-        <w:rPr>
-          <w:b/>
-          <w:bCs/>
-          <w:sz w:val="22"/>
-          <w:szCs w:val="22"/>
-        </w:rPr>
-      </w:pPr>
-    </w:p>
-    <w:p>
-      <w:pPr>
-        <w:spacing w:line="360" w:lineRule="auto"/>
-        <w:rPr>
-          <w:b/>
-          <w:bCs/>
-          <w:sz w:val="22"/>
-          <w:szCs w:val="22"/>
-        </w:rPr>
-      </w:pPr>
-    </w:p>
-    <w:p>
-      <w:pPr>
-        <w:spacing w:line="360" w:lineRule="auto"/>
-        <w:rPr>
-          <w:b/>
-          <w:bCs/>
-          <w:sz w:val="22"/>
-          <w:szCs w:val="22"/>
-        </w:rPr>
-      </w:pPr>
-    </w:p>
-    <w:p>
-      <w:pPr>
-        <w:spacing w:line="360" w:lineRule="auto"/>
-        <w:rPr>
-          <w:b/>
-          <w:bCs/>
-          <w:sz w:val="22"/>
-          <w:szCs w:val="22"/>
-        </w:rPr>
-      </w:pPr>
-    </w:p>
-    <w:p>
-      <w:pPr>
-        <w:spacing w:line="360" w:lineRule="auto"/>
-        <w:rPr>
           <w:b/>
           <w:bCs/>
           <w:sz w:val="22"/>
@@ -3320,7 +2858,6 @@
           <w:bCs/>
           <w:color w:val="000000" w:themeColor="text1"/>
         </w:rPr>
-        <w:lastRenderedPageBreak/>
         <w:t>5. Gallery- gallery.html</w:t>
       </w:r>
       <w:bookmarkEnd w:id="7"/>
@@ -3820,6 +3357,7 @@
           <w:lang w:eastAsia="en-ZA"/>
           <w14:ligatures w14:val="none"/>
         </w:rPr>
+        <w:lastRenderedPageBreak/>
         <w:t>Additional requirements:</w:t>
       </w:r>
     </w:p>
@@ -3849,7 +3387,6 @@
           <w:lang w:eastAsia="en-ZA"/>
           <w14:ligatures w14:val="none"/>
         </w:rPr>
-        <w:lastRenderedPageBreak/>
         <w:t xml:space="preserve">Special requests </w:t>
       </w:r>
     </w:p>
@@ -5121,19 +4658,9 @@
         </w:rPr>
       </w:pPr>
       <w:bookmarkStart w:id="15" w:name="_Toc237019719"/>
-    </w:p>
-    <w:p>
-      <w:pPr>
-        <w:pStyle w:val="Heading1"/>
-        <w:spacing w:line="360" w:lineRule="auto"/>
-        <w:rPr>
-          <w:rFonts w:asciiTheme="minorHAnsi" w:hAnsiTheme="minorHAnsi"/>
-          <w:sz w:val="22"/>
-          <w:szCs w:val="22"/>
-        </w:rPr>
-      </w:pPr>
       <w:bookmarkStart w:id="16" w:name="_Toc237466579"/>
     </w:p>
+    <w:p/>
     <w:p>
       <w:pPr>
         <w:pStyle w:val="Heading1"/>
@@ -5156,6 +4683,7 @@
           <w:sz w:val="32"/>
           <w:szCs w:val="32"/>
         </w:rPr>
+        <w:lastRenderedPageBreak/>
         <w:t>References</w:t>
       </w:r>
       <w:bookmarkEnd w:id="16"/>
@@ -5776,7 +5304,7 @@
       <w:lvlPicBulletId w:val="0"/>
       <w:lvlJc w:val="left"/>
       <w:pPr>
-        <w:ind w:left="720" w:hanging="360"/>
+        <w:ind w:left="360" w:hanging="360"/>
       </w:pPr>
       <w:rPr>
         <w:rFonts w:ascii="Symbol" w:hAnsi="Symbol" w:hint="default"/>
@@ -5788,7 +5316,7 @@
       <w:lvlText w:val="o"/>
       <w:lvlJc w:val="left"/>
       <w:pPr>
-        <w:ind w:left="1440" w:hanging="360"/>
+        <w:ind w:left="1080" w:hanging="360"/>
       </w:pPr>
       <w:rPr>
         <w:rFonts w:ascii="Courier New" w:hAnsi="Courier New" w:cs="Courier New" w:hint="default"/>
@@ -5800,7 +5328,7 @@
       <w:lvlText w:val=""/>
       <w:lvlJc w:val="left"/>
       <w:pPr>
-        <w:ind w:left="2160" w:hanging="360"/>
+        <w:ind w:left="1800" w:hanging="360"/>
       </w:pPr>
       <w:rPr>
         <w:rFonts w:ascii="Wingdings" w:hAnsi="Wingdings" w:hint="default"/>
@@ -5812,7 +5340,7 @@
       <w:lvlText w:val=""/>
       <w:lvlJc w:val="left"/>
       <w:pPr>
-        <w:ind w:left="2880" w:hanging="360"/>
+        <w:ind w:left="2520" w:hanging="360"/>
       </w:pPr>
       <w:rPr>
         <w:rFonts w:ascii="Symbol" w:hAnsi="Symbol" w:hint="default"/>
@@ -5824,7 +5352,7 @@
       <w:lvlText w:val="o"/>
       <w:lvlJc w:val="left"/>
       <w:pPr>
-        <w:ind w:left="3600" w:hanging="360"/>
+        <w:ind w:left="3240" w:hanging="360"/>
       </w:pPr>
       <w:rPr>
         <w:rFonts w:ascii="Courier New" w:hAnsi="Courier New" w:cs="Courier New" w:hint="default"/>
@@ -5836,7 +5364,7 @@
       <w:lvlText w:val=""/>
       <w:lvlJc w:val="left"/>
       <w:pPr>
-        <w:ind w:left="4320" w:hanging="360"/>
+        <w:ind w:left="3960" w:hanging="360"/>
       </w:pPr>
       <w:rPr>
         <w:rFonts w:ascii="Wingdings" w:hAnsi="Wingdings" w:hint="default"/>
@@ -5848,7 +5376,7 @@
       <w:lvlText w:val=""/>
       <w:lvlJc w:val="left"/>
       <w:pPr>
-        <w:ind w:left="5040" w:hanging="360"/>
+        <w:ind w:left="4680" w:hanging="360"/>
       </w:pPr>
       <w:rPr>
         <w:rFonts w:ascii="Symbol" w:hAnsi="Symbol" w:hint="default"/>
@@ -5860,7 +5388,7 @@
       <w:lvlText w:val="o"/>
       <w:lvlJc w:val="left"/>
       <w:pPr>
-        <w:ind w:left="5760" w:hanging="360"/>
+        <w:ind w:left="5400" w:hanging="360"/>
       </w:pPr>
       <w:rPr>
         <w:rFonts w:ascii="Courier New" w:hAnsi="Courier New" w:cs="Courier New" w:hint="default"/>
@@ -5872,7 +5400,7 @@
       <w:lvlText w:val=""/>
       <w:lvlJc w:val="left"/>
       <w:pPr>
-        <w:ind w:left="6480" w:hanging="360"/>
+        <w:ind w:left="6120" w:hanging="360"/>
       </w:pPr>
       <w:rPr>
         <w:rFonts w:ascii="Wingdings" w:hAnsi="Wingdings" w:hint="default"/>

</xml_diff>